<commit_message>
chore(pages): publica correção da formação
</commit_message>
<xml_diff>
--- a/resume/Evanilson_Freitas_Curriculo.docx
+++ b/resume/Evanilson_Freitas_Curriculo.docx
@@ -179,7 +179,7 @@
               <w:t xml:space="preserve">E-mail
 </w:t>
             </w:r>
-            <w:hyperlink w:history="1" r:id="rId6wt7b07crvrk6df7dkrpx">
+            <w:hyperlink w:history="1" r:id="rIdfqwktagjmdqtuqpzmgfss">
               <w:r>
                 <w:rPr>
                   <w:rFonts w:ascii="Arial" w:cs="Arial" w:eastAsia="Arial" w:hAnsi="Arial"/>
@@ -206,7 +206,7 @@
               <w:t xml:space="preserve">LinkedIn
 </w:t>
             </w:r>
-            <w:hyperlink w:history="1" r:id="rId7i4hnip5g1alnmbbmtwlc">
+            <w:hyperlink w:history="1" r:id="rIdrxfun8ylkjxeinm2ikw51">
               <w:r>
                 <w:rPr>
                   <w:rFonts w:ascii="Arial" w:cs="Arial" w:eastAsia="Arial" w:hAnsi="Arial"/>
@@ -233,7 +233,7 @@
               <w:t xml:space="preserve">GitHub
 </w:t>
             </w:r>
-            <w:hyperlink w:history="1" r:id="rIdm-7iinuad325jxttcptl_">
+            <w:hyperlink w:history="1" r:id="rId0bazjhspltvdrzhdqbyqc">
               <w:r>
                 <w:rPr>
                   <w:rFonts w:ascii="Arial" w:cs="Arial" w:eastAsia="Arial" w:hAnsi="Arial"/>
@@ -260,7 +260,7 @@
               <w:t xml:space="preserve">Portfólio
 </w:t>
             </w:r>
-            <w:hyperlink w:history="1" r:id="rIdo1wqwq_qu-x2vnkh883pt">
+            <w:hyperlink w:history="1" r:id="rId0nmlwvb4ejxpvkxt7wdyk">
               <w:r>
                 <w:rPr>
                   <w:rFonts w:ascii="Arial" w:cs="Arial" w:eastAsia="Arial" w:hAnsi="Arial"/>
@@ -602,32 +602,6 @@
                 <w:szCs w:val="18"/>
               </w:rPr>
               <w:t xml:space="preserve">Colação de grau: 30/07/2024</w:t>
-            </w:r>
-          </w:p>
-          <w:p>
-            <w:pPr>
-              <w:keepNext/>
-              <w:spacing w:after="20" w:before="60"/>
-            </w:pPr>
-            <w:r>
-              <w:rPr>
-                <w:rFonts w:ascii="Arial" w:cs="Arial" w:eastAsia="Arial" w:hAnsi="Arial"/>
-                <w:b/>
-                <w:bCs/>
-                <w:color w:val="1F2328"/>
-                <w:sz w:val="19"/>
-                <w:szCs w:val="19"/>
-              </w:rPr>
-              <w:t xml:space="preserve">Mestrado em Engenharia de Software</w:t>
-            </w:r>
-            <w:r>
-              <w:rPr>
-                <w:rFonts w:ascii="Arial" w:cs="Arial" w:eastAsia="Arial" w:hAnsi="Arial"/>
-                <w:color w:val="59636E"/>
-                <w:sz w:val="18"/>
-                <w:szCs w:val="18"/>
-              </w:rPr>
-              <w:t xml:space="preserve">  Matriculado</w:t>
             </w:r>
           </w:p>
           <w:p>

</xml_diff>

<commit_message>
chore(pages): publica a V3.0
</commit_message>
<xml_diff>
--- a/resume/Evanilson_Freitas_Curriculo.docx
+++ b/resume/Evanilson_Freitas_Curriculo.docx
@@ -113,7 +113,7 @@
                 <w:sz w:val="20"/>
                 <w:szCs w:val="20"/>
               </w:rPr>
-              <w:t xml:space="preserve">Dados e Software</w:t>
+              <w:t xml:space="preserve">Business Intelligence</w:t>
             </w:r>
           </w:p>
           <w:p>
@@ -127,7 +127,7 @@
                 <w:sz w:val="16"/>
                 <w:szCs w:val="16"/>
               </w:rPr>
-              <w:t xml:space="preserve">Business Intelligence / Data Science / Software Engineering</w:t>
+              <w:t xml:space="preserve">Data Science / Engenharia de Software / Inteligência de Negócios</w:t>
             </w:r>
           </w:p>
           <w:p>
@@ -179,7 +179,7 @@
               <w:t xml:space="preserve">E-mail
 </w:t>
             </w:r>
-            <w:hyperlink w:history="1" r:id="rIdfqwktagjmdqtuqpzmgfss">
+            <w:hyperlink w:history="1" r:id="rIdr8kf1f1n3sk_azrr2whnw">
               <w:r>
                 <w:rPr>
                   <w:rFonts w:ascii="Arial" w:cs="Arial" w:eastAsia="Arial" w:hAnsi="Arial"/>
@@ -206,7 +206,7 @@
               <w:t xml:space="preserve">LinkedIn
 </w:t>
             </w:r>
-            <w:hyperlink w:history="1" r:id="rIdrxfun8ylkjxeinm2ikw51">
+            <w:hyperlink w:history="1" r:id="rIdulppkedxj67ybjtnvx2s3">
               <w:r>
                 <w:rPr>
                   <w:rFonts w:ascii="Arial" w:cs="Arial" w:eastAsia="Arial" w:hAnsi="Arial"/>
@@ -233,7 +233,7 @@
               <w:t xml:space="preserve">GitHub
 </w:t>
             </w:r>
-            <w:hyperlink w:history="1" r:id="rId0bazjhspltvdrzhdqbyqc">
+            <w:hyperlink w:history="1" r:id="rId4lbt4wes_gmo53_-k7mwk">
               <w:r>
                 <w:rPr>
                   <w:rFonts w:ascii="Arial" w:cs="Arial" w:eastAsia="Arial" w:hAnsi="Arial"/>
@@ -260,7 +260,7 @@
               <w:t xml:space="preserve">Portfólio
 </w:t>
             </w:r>
-            <w:hyperlink w:history="1" r:id="rId0nmlwvb4ejxpvkxt7wdyk">
+            <w:hyperlink w:history="1" r:id="rIdb_kit1ucyibkgmzfra5o_">
               <w:r>
                 <w:rPr>
                   <w:rFonts w:ascii="Arial" w:cs="Arial" w:eastAsia="Arial" w:hAnsi="Arial"/>
@@ -308,7 +308,7 @@
                 <w:sz w:val="17"/>
                 <w:szCs w:val="17"/>
               </w:rPr>
-              <w:t xml:space="preserve">Business Intelligence &amp; Analytics</w:t>
+              <w:t xml:space="preserve">Business Intelligence e Analytics</w:t>
             </w:r>
           </w:p>
           <w:p>
@@ -322,7 +322,7 @@
                 <w:sz w:val="17"/>
                 <w:szCs w:val="17"/>
               </w:rPr>
-              <w:t xml:space="preserve">Power BI, DAX, Power Query, Modelagem dimensional, Indicadores</w:t>
+              <w:t xml:space="preserve">Power BI, DAX, Power Query, Modelagem dimensional, Indicadores e metas</w:t>
             </w:r>
           </w:p>
           <w:p>
@@ -339,7 +339,7 @@
                 <w:sz w:val="17"/>
                 <w:szCs w:val="17"/>
               </w:rPr>
-              <w:t xml:space="preserve">Data Science &amp; Engenharia de Dados</w:t>
+              <w:t xml:space="preserve">Engenharia de dados e SQL Server</w:t>
             </w:r>
           </w:p>
           <w:p>
@@ -353,7 +353,7 @@
                 <w:sz w:val="17"/>
                 <w:szCs w:val="17"/>
               </w:rPr>
-              <w:t xml:space="preserve">Python, SQL, Estatística, ETL, Machine Learning</w:t>
+              <w:t xml:space="preserve">SQL Server, T-SQL, ETL, Python, Normalização de dados</w:t>
             </w:r>
           </w:p>
           <w:p>
@@ -384,7 +384,7 @@
                 <w:sz w:val="17"/>
                 <w:szCs w:val="17"/>
               </w:rPr>
-              <w:t xml:space="preserve">TypeScript, React, Next.js, Python, FastAPI, C#, ASP.NET Core, Entity Framework Core, SQL Server, Git</w:t>
+              <w:t xml:space="preserve">Python, FastAPI, TypeScript, React, Next.js, C#, ASP.NET Core, Entity Framework Core, Git</w:t>
             </w:r>
           </w:p>
           <w:p>
@@ -401,7 +401,7 @@
                 <w:sz w:val="17"/>
                 <w:szCs w:val="17"/>
               </w:rPr>
-              <w:t xml:space="preserve">Análise de Negócios &amp; Precificação</w:t>
+              <w:t xml:space="preserve">Integrações e automações</w:t>
             </w:r>
           </w:p>
           <w:p>
@@ -415,7 +415,69 @@
                 <w:sz w:val="17"/>
                 <w:szCs w:val="17"/>
               </w:rPr>
-              <w:t xml:space="preserve">Metodologia cost-plus, Regras de pricing, Análise de sensibilidade, Indicadores, Governança de acesso</w:t>
+              <w:t xml:space="preserve">REST, OAuth 2.0, JWT, Webhooks, Power Automate</w:t>
+            </w:r>
+          </w:p>
+          <w:p>
+            <w:pPr>
+              <w:keepNext/>
+              <w:spacing w:after="20" w:before="70"/>
+            </w:pPr>
+            <w:r>
+              <w:rPr>
+                <w:rFonts w:ascii="Arial" w:cs="Arial" w:eastAsia="Arial" w:hAnsi="Arial"/>
+                <w:b/>
+                <w:bCs/>
+                <w:color w:val="FFFFFF"/>
+                <w:sz w:val="17"/>
+                <w:szCs w:val="17"/>
+              </w:rPr>
+              <w:t xml:space="preserve">Precificação e análise de negócios</w:t>
+            </w:r>
+          </w:p>
+          <w:p>
+            <w:pPr>
+              <w:spacing w:after="50" w:before="0"/>
+            </w:pPr>
+            <w:r>
+              <w:rPr>
+                <w:rFonts w:ascii="Arial" w:cs="Arial" w:eastAsia="Arial" w:hAnsi="Arial"/>
+                <w:color w:val="E6EDF3"/>
+                <w:sz w:val="17"/>
+                <w:szCs w:val="17"/>
+              </w:rPr>
+              <w:t xml:space="preserve">Cost-plus, Margem e markup, Análise de sensibilidade, Governança de acesso</w:t>
+            </w:r>
+          </w:p>
+          <w:p>
+            <w:pPr>
+              <w:keepNext/>
+              <w:spacing w:after="20" w:before="70"/>
+            </w:pPr>
+            <w:r>
+              <w:rPr>
+                <w:rFonts w:ascii="Arial" w:cs="Arial" w:eastAsia="Arial" w:hAnsi="Arial"/>
+                <w:b/>
+                <w:bCs/>
+                <w:color w:val="FFFFFF"/>
+                <w:sz w:val="17"/>
+                <w:szCs w:val="17"/>
+              </w:rPr>
+              <w:t xml:space="preserve">Data Science e IA aplicada</w:t>
+            </w:r>
+          </w:p>
+          <w:p>
+            <w:pPr>
+              <w:spacing w:after="50" w:before="0"/>
+            </w:pPr>
+            <w:r>
+              <w:rPr>
+                <w:rFonts w:ascii="Arial" w:cs="Arial" w:eastAsia="Arial" w:hAnsi="Arial"/>
+                <w:color w:val="E6EDF3"/>
+                <w:sz w:val="17"/>
+                <w:szCs w:val="17"/>
+              </w:rPr>
+              <w:t xml:space="preserve">Estatística, Python, RAG, Agentes (estudo)</w:t>
             </w:r>
           </w:p>
         </w:tc>
@@ -468,7 +530,7 @@
                 <w:sz w:val="19"/>
                 <w:szCs w:val="19"/>
               </w:rPr>
-              <w:t xml:space="preserve">Profissional de dados e software, com formação em Análise e Desenvolvimento de Sistemas (Uninove) e MBA em Data Science (USP/ESALQ). Desenvolve soluções de Business Intelligence, análise de dados e aplicações web, com projetos em Python, SQL Server, TypeScript, React e ASP.NET Core.</w:t>
+              <w:t xml:space="preserve">Profissional de Business Intelligence e Engenharia de Software, com formação em Análise e Desenvolvimento de Sistemas (Uninove) e MBA em Data Science (USP/ESALQ). Conecta processos de negócio a soluções de dados, automação e software: BI comercial e operacional, precificação, integrações entre sistemas e aplicações web, com projetos em Python, FastAPI, SQL Server, TypeScript, React e ASP.NET Core.</w:t>
             </w:r>
           </w:p>
           <w:p>
@@ -704,7 +766,7 @@
                 <w:sz w:val="19"/>
                 <w:szCs w:val="19"/>
               </w:rPr>
-              <w:t xml:space="preserve">Marivan Finance</w:t>
+              <w:t xml:space="preserve">Inteligência comercial e CRM</w:t>
             </w:r>
             <w:r>
               <w:rPr>
@@ -713,7 +775,7 @@
                 <w:sz w:val="18"/>
                 <w:szCs w:val="18"/>
               </w:rPr>
-              <w:t xml:space="preserve">  Projeto autoral</w:t>
+              <w:t xml:space="preserve">  Estudo · BI comercial</w:t>
             </w:r>
           </w:p>
           <w:p>
@@ -727,7 +789,7 @@
                 <w:sz w:val="19"/>
                 <w:szCs w:val="19"/>
               </w:rPr>
-              <w:t xml:space="preserve">Aplicação web para controle e planejamento financeiro: despesas, categorias, rateios, comprovantes e indicadores. Repositório privado.</w:t>
+              <w:t xml:space="preserve">Como transformar oportunidades, propostas e estágios de um CRM em indicadores comerciais com definição única, do funil ao forecast.</w:t>
             </w:r>
           </w:p>
           <w:p>
@@ -743,7 +805,7 @@
                 <w:sz w:val="18"/>
                 <w:szCs w:val="18"/>
               </w:rPr>
-              <w:t xml:space="preserve">Tecnologias: </w:t>
+              <w:t xml:space="preserve">Conceitos e ferramentas: </w:t>
             </w:r>
             <w:r>
               <w:rPr>
@@ -752,7 +814,7 @@
                 <w:sz w:val="18"/>
                 <w:szCs w:val="18"/>
               </w:rPr>
-              <w:t xml:space="preserve">ASP.NET Core 10, C#, Entity Framework Core, SQL Server, Windows Authentication, IIS, GitHub</w:t>
+              <w:t xml:space="preserve">Modelagem dimensional, DAX, Power BI, indicadores comerciais</w:t>
             </w:r>
           </w:p>
           <w:p>
@@ -818,6 +880,71 @@
                 <w:szCs w:val="18"/>
               </w:rPr>
               <w:t xml:space="preserve">Modelagem dimensional, SQL, ETL, Power BI, DAX</w:t>
+            </w:r>
+          </w:p>
+          <w:p>
+            <w:pPr>
+              <w:keepNext/>
+              <w:spacing w:after="20" w:before="70"/>
+            </w:pPr>
+            <w:r>
+              <w:rPr>
+                <w:rFonts w:ascii="Arial" w:cs="Arial" w:eastAsia="Arial" w:hAnsi="Arial"/>
+                <w:b/>
+                <w:bCs/>
+                <w:color w:val="1F2328"/>
+                <w:sz w:val="19"/>
+                <w:szCs w:val="19"/>
+              </w:rPr>
+              <w:t xml:space="preserve">Normalização de cidades com referência do IBGE</w:t>
+            </w:r>
+            <w:r>
+              <w:rPr>
+                <w:rFonts w:ascii="Arial" w:cs="Arial" w:eastAsia="Arial" w:hAnsi="Arial"/>
+                <w:color w:val="59636E"/>
+                <w:sz w:val="18"/>
+                <w:szCs w:val="18"/>
+              </w:rPr>
+              <w:t xml:space="preserve">  Estudo · qualidade de dados</w:t>
+            </w:r>
+          </w:p>
+          <w:p>
+            <w:pPr>
+              <w:spacing w:after="20" w:before="0"/>
+            </w:pPr>
+            <w:r>
+              <w:rPr>
+                <w:rFonts w:ascii="Arial" w:cs="Arial" w:eastAsia="Arial" w:hAnsi="Arial"/>
+                <w:color w:val="1F2328"/>
+                <w:sz w:val="19"/>
+                <w:szCs w:val="19"/>
+              </w:rPr>
+              <w:t xml:space="preserve">Estudo de como reconciliar nomes de cidades digitados de forma livre com uma lista oficial, de modo determinístico e auditável.</w:t>
+            </w:r>
+          </w:p>
+          <w:p>
+            <w:pPr>
+              <w:spacing w:after="40" w:before="0"/>
+            </w:pPr>
+            <w:r>
+              <w:rPr>
+                <w:rFonts w:ascii="Arial" w:cs="Arial" w:eastAsia="Arial" w:hAnsi="Arial"/>
+                <w:b/>
+                <w:bCs/>
+                <w:color w:val="59636E"/>
+                <w:sz w:val="18"/>
+                <w:szCs w:val="18"/>
+              </w:rPr>
+              <w:t xml:space="preserve">Conceitos e ferramentas: </w:t>
+            </w:r>
+            <w:r>
+              <w:rPr>
+                <w:rFonts w:ascii="Arial" w:cs="Arial" w:eastAsia="Arial" w:hAnsi="Arial"/>
+                <w:color w:val="59636E"/>
+                <w:sz w:val="18"/>
+                <w:szCs w:val="18"/>
+              </w:rPr>
+              <w:t xml:space="preserve">Python, normalização de texto, similaridade, SQL</w:t>
             </w:r>
           </w:p>
         </w:tc>

</xml_diff>

<commit_message>
chore(pages): publica a V3.1
</commit_message>
<xml_diff>
--- a/resume/Evanilson_Freitas_Curriculo.docx
+++ b/resume/Evanilson_Freitas_Curriculo.docx
@@ -64,7 +64,7 @@
                           </pic:cNvPicPr>
                         </pic:nvPicPr>
                         <pic:blipFill>
-                          <a:blip r:embed="rId11" cstate="none"/>
+                          <a:blip r:embed="rId12" cstate="none"/>
                           <a:srcRect/>
                           <a:stretch>
                             <a:fillRect/>
@@ -179,7 +179,7 @@
               <w:t xml:space="preserve">E-mail
 </w:t>
             </w:r>
-            <w:hyperlink w:history="1" r:id="rIdr8kf1f1n3sk_azrr2whnw">
+            <w:hyperlink w:history="1" r:id="rIdrdytobfe9y9klhdzugqaq">
               <w:r>
                 <w:rPr>
                   <w:rFonts w:ascii="Arial" w:cs="Arial" w:eastAsia="Arial" w:hAnsi="Arial"/>
@@ -188,7 +188,7 @@
                   <w:szCs w:val="18"/>
                   <w:u w:val="single"/>
                 </w:rPr>
-                <w:t xml:space="preserve">Evanilson.2631@hotmail.com</w:t>
+                <w:t xml:space="preserve">Evanilson.2631@outlook.com</w:t>
               </w:r>
             </w:hyperlink>
           </w:p>
@@ -203,10 +203,37 @@
                 <w:sz w:val="16"/>
                 <w:szCs w:val="16"/>
               </w:rPr>
+              <w:t xml:space="preserve">Telefone
+</w:t>
+            </w:r>
+            <w:hyperlink w:history="1" r:id="rIdibjg9fbs0xwa5dtinp7x7">
+              <w:r>
+                <w:rPr>
+                  <w:rFonts w:ascii="Arial" w:cs="Arial" w:eastAsia="Arial" w:hAnsi="Arial"/>
+                  <w:color w:val="FFFFFF"/>
+                  <w:sz w:val="18"/>
+                  <w:szCs w:val="18"/>
+                  <w:u w:val="single"/>
+                </w:rPr>
+                <w:t xml:space="preserve">+55 11 96463-9228</w:t>
+              </w:r>
+            </w:hyperlink>
+          </w:p>
+          <w:p>
+            <w:pPr>
+              <w:spacing w:after="70" w:before="0"/>
+            </w:pPr>
+            <w:r>
+              <w:rPr>
+                <w:rFonts w:ascii="Arial" w:cs="Arial" w:eastAsia="Arial" w:hAnsi="Arial"/>
+                <w:color w:val="AEB7C0"/>
+                <w:sz w:val="16"/>
+                <w:szCs w:val="16"/>
+              </w:rPr>
               <w:t xml:space="preserve">LinkedIn
 </w:t>
             </w:r>
-            <w:hyperlink w:history="1" r:id="rIdulppkedxj67ybjtnvx2s3">
+            <w:hyperlink w:history="1" r:id="rIds1f1eizg1eum0qfixt_vr">
               <w:r>
                 <w:rPr>
                   <w:rFonts w:ascii="Arial" w:cs="Arial" w:eastAsia="Arial" w:hAnsi="Arial"/>
@@ -233,7 +260,7 @@
               <w:t xml:space="preserve">GitHub
 </w:t>
             </w:r>
-            <w:hyperlink w:history="1" r:id="rId4lbt4wes_gmo53_-k7mwk">
+            <w:hyperlink w:history="1" r:id="rId7gblxas9comojo3tsq5uv">
               <w:r>
                 <w:rPr>
                   <w:rFonts w:ascii="Arial" w:cs="Arial" w:eastAsia="Arial" w:hAnsi="Arial"/>
@@ -260,7 +287,7 @@
               <w:t xml:space="preserve">Portfólio
 </w:t>
             </w:r>
-            <w:hyperlink w:history="1" r:id="rIdb_kit1ucyibkgmzfra5o_">
+            <w:hyperlink w:history="1" r:id="rIdx5bqs78cuewxmcvtc5pel">
               <w:r>
                 <w:rPr>
                   <w:rFonts w:ascii="Arial" w:cs="Arial" w:eastAsia="Arial" w:hAnsi="Arial"/>
@@ -308,7 +335,7 @@
                 <w:sz w:val="17"/>
                 <w:szCs w:val="17"/>
               </w:rPr>
-              <w:t xml:space="preserve">Business Intelligence e Analytics</w:t>
+              <w:t xml:space="preserve">Business Intelligence</w:t>
             </w:r>
           </w:p>
           <w:p>
@@ -322,7 +349,7 @@
                 <w:sz w:val="17"/>
                 <w:szCs w:val="17"/>
               </w:rPr>
-              <w:t xml:space="preserve">Power BI, DAX, Power Query, Modelagem dimensional, Indicadores e metas</w:t>
+              <w:t xml:space="preserve">Power BI, DAX, Power Query, Modelagem dimensional, Data visualization, UX/UI de dashboards</w:t>
             </w:r>
           </w:p>
           <w:p>
@@ -339,7 +366,7 @@
                 <w:sz w:val="17"/>
                 <w:szCs w:val="17"/>
               </w:rPr>
-              <w:t xml:space="preserve">Engenharia de dados e SQL Server</w:t>
+              <w:t xml:space="preserve">Dados e SQL</w:t>
             </w:r>
           </w:p>
           <w:p>
@@ -353,7 +380,7 @@
                 <w:sz w:val="17"/>
                 <w:szCs w:val="17"/>
               </w:rPr>
-              <w:t xml:space="preserve">SQL Server, T-SQL, ETL, Python, Normalização de dados</w:t>
+              <w:t xml:space="preserve">SQL Server, T-SQL, Procedures e views, ETL, Python</w:t>
             </w:r>
           </w:p>
           <w:p>
@@ -384,7 +411,7 @@
                 <w:sz w:val="17"/>
                 <w:szCs w:val="17"/>
               </w:rPr>
-              <w:t xml:space="preserve">Python, FastAPI, TypeScript, React, Next.js, C#, ASP.NET Core, Entity Framework Core, Git</w:t>
+              <w:t xml:space="preserve">Python, FastAPI, TypeScript, React, Next.js, C#, ASP.NET Core, APIs REST</w:t>
             </w:r>
           </w:p>
           <w:p>
@@ -401,7 +428,7 @@
                 <w:sz w:val="17"/>
                 <w:szCs w:val="17"/>
               </w:rPr>
-              <w:t xml:space="preserve">Integrações e automações</w:t>
+              <w:t xml:space="preserve">Automação e integrações</w:t>
             </w:r>
           </w:p>
           <w:p>
@@ -415,7 +442,7 @@
                 <w:sz w:val="17"/>
                 <w:szCs w:val="17"/>
               </w:rPr>
-              <w:t xml:space="preserve">REST, OAuth 2.0, JWT, Webhooks, Power Automate</w:t>
+              <w:t xml:space="preserve">Power Automate, REST, CRM, ERP e TMS</w:t>
             </w:r>
           </w:p>
           <w:p>
@@ -432,7 +459,7 @@
                 <w:sz w:val="17"/>
                 <w:szCs w:val="17"/>
               </w:rPr>
-              <w:t xml:space="preserve">Precificação e análise de negócios</w:t>
+              <w:t xml:space="preserve">Infraestrutura e entrega</w:t>
             </w:r>
           </w:p>
           <w:p>
@@ -446,38 +473,7 @@
                 <w:sz w:val="17"/>
                 <w:szCs w:val="17"/>
               </w:rPr>
-              <w:t xml:space="preserve">Cost-plus, Margem e markup, Análise de sensibilidade, Governança de acesso</w:t>
-            </w:r>
-          </w:p>
-          <w:p>
-            <w:pPr>
-              <w:keepNext/>
-              <w:spacing w:after="20" w:before="70"/>
-            </w:pPr>
-            <w:r>
-              <w:rPr>
-                <w:rFonts w:ascii="Arial" w:cs="Arial" w:eastAsia="Arial" w:hAnsi="Arial"/>
-                <w:b/>
-                <w:bCs/>
-                <w:color w:val="FFFFFF"/>
-                <w:sz w:val="17"/>
-                <w:szCs w:val="17"/>
-              </w:rPr>
-              <w:t xml:space="preserve">Data Science e IA aplicada</w:t>
-            </w:r>
-          </w:p>
-          <w:p>
-            <w:pPr>
-              <w:spacing w:after="50" w:before="0"/>
-            </w:pPr>
-            <w:r>
-              <w:rPr>
-                <w:rFonts w:ascii="Arial" w:cs="Arial" w:eastAsia="Arial" w:hAnsi="Arial"/>
-                <w:color w:val="E6EDF3"/>
-                <w:sz w:val="17"/>
-                <w:szCs w:val="17"/>
-              </w:rPr>
-              <w:t xml:space="preserve">Estatística, Python, RAG, Agentes (estudo)</w:t>
+              <w:t xml:space="preserve">IIS, Windows Server, Proxy reverso, Git, CI/CD (conceitos), Azure e Azure DevOps (estudo)</w:t>
             </w:r>
           </w:p>
         </w:tc>
@@ -530,7 +526,7 @@
                 <w:sz w:val="19"/>
                 <w:szCs w:val="19"/>
               </w:rPr>
-              <w:t xml:space="preserve">Profissional de Business Intelligence e Engenharia de Software, com formação em Análise e Desenvolvimento de Sistemas (Uninove) e MBA em Data Science (USP/ESALQ). Conecta processos de negócio a soluções de dados, automação e software: BI comercial e operacional, precificação, integrações entre sistemas e aplicações web, com projetos em Python, FastAPI, SQL Server, TypeScript, React e ASP.NET Core.</w:t>
+              <w:t xml:space="preserve">Profissional de Business Intelligence e Engenharia de Software, com formação em Análise e Desenvolvimento de Sistemas (Uninove) e MBA em Data Science (USP/ESALQ). Conecta processos de negócio a soluções de dados, automação e software: BI comercial e operacional, precificação, integrações entre sistemas e aplicações web, com projetos em Python, FastAPI, SQL Server, TypeScript e React, e noções de hospedagem em Windows Server e IIS.</w:t>
             </w:r>
           </w:p>
           <w:p>
@@ -701,7 +697,7 @@
                 <w:sz w:val="19"/>
                 <w:szCs w:val="19"/>
               </w:rPr>
-              <w:t xml:space="preserve">EasyPrice</w:t>
+              <w:t xml:space="preserve">BI operacional</w:t>
             </w:r>
             <w:r>
               <w:rPr>
@@ -710,7 +706,7 @@
                 <w:sz w:val="18"/>
                 <w:szCs w:val="18"/>
               </w:rPr>
-              <w:t xml:space="preserve">  Corporativo</w:t>
+              <w:t xml:space="preserve">  Business Intelligence</w:t>
             </w:r>
           </w:p>
           <w:p>
@@ -724,7 +720,7 @@
                 <w:sz w:val="19"/>
                 <w:szCs w:val="19"/>
               </w:rPr>
-              <w:t xml:space="preserve">Plataforma web para simulação de preços de frete rodoviário (LTL e FTL), baseada em regras de pricing e na metodologia cost-plus. Código e dados não públicos.</w:t>
+              <w:t xml:space="preserve">Soluções de inteligência operacional: produtividade, coleta e entrega, SLA, extravio e avaria, ocorrências, qualidade e metas por filial, com visão executiva. Dados e telas não públicos.</w:t>
             </w:r>
           </w:p>
           <w:p>
@@ -740,7 +736,7 @@
                 <w:sz w:val="18"/>
                 <w:szCs w:val="18"/>
               </w:rPr>
-              <w:t xml:space="preserve">Tecnologias: </w:t>
+              <w:t xml:space="preserve">Ferramentas: </w:t>
             </w:r>
             <w:r>
               <w:rPr>
@@ -749,7 +745,7 @@
                 <w:sz w:val="18"/>
                 <w:szCs w:val="18"/>
               </w:rPr>
-              <w:t xml:space="preserve">Python, FastAPI, React, Next.js, TypeScript, SQL Server</w:t>
+              <w:t xml:space="preserve">Power BI, DAX, Power Query, SQL, modelagem dimensional, data visualization, UX/UI</w:t>
             </w:r>
           </w:p>
           <w:p>
@@ -766,7 +762,7 @@
                 <w:sz w:val="19"/>
                 <w:szCs w:val="19"/>
               </w:rPr>
-              <w:t xml:space="preserve">Inteligência comercial e CRM</w:t>
+              <w:t xml:space="preserve">BI comercial</w:t>
             </w:r>
             <w:r>
               <w:rPr>
@@ -775,7 +771,7 @@
                 <w:sz w:val="18"/>
                 <w:szCs w:val="18"/>
               </w:rPr>
-              <w:t xml:space="preserve">  Estudo · BI comercial</w:t>
+              <w:t xml:space="preserve">  Business Intelligence</w:t>
             </w:r>
           </w:p>
           <w:p>
@@ -789,7 +785,7 @@
                 <w:sz w:val="19"/>
                 <w:szCs w:val="19"/>
               </w:rPr>
-              <w:t xml:space="preserve">Como transformar oportunidades, propostas e estágios de um CRM em indicadores comerciais com definição única, do funil ao forecast.</w:t>
+              <w:t xml:space="preserve">Inteligência comercial: funil e oportunidades, hit rate, tracker comercial, price e frete por kg, margem e rentabilidade. Dados e telas não públicos.</w:t>
             </w:r>
           </w:p>
           <w:p>
@@ -805,7 +801,7 @@
                 <w:sz w:val="18"/>
                 <w:szCs w:val="18"/>
               </w:rPr>
-              <w:t xml:space="preserve">Conceitos e ferramentas: </w:t>
+              <w:t xml:space="preserve">Ferramentas: </w:t>
             </w:r>
             <w:r>
               <w:rPr>
@@ -814,7 +810,7 @@
                 <w:sz w:val="18"/>
                 <w:szCs w:val="18"/>
               </w:rPr>
-              <w:t xml:space="preserve">Modelagem dimensional, DAX, Power BI, indicadores comerciais</w:t>
+              <w:t xml:space="preserve">Power BI, DAX, Power Query, SQL Server, CRM, Power Automate, storytelling com dados</w:t>
             </w:r>
           </w:p>
           <w:p>
@@ -831,7 +827,7 @@
                 <w:sz w:val="19"/>
                 <w:szCs w:val="19"/>
               </w:rPr>
-              <w:t xml:space="preserve">BI operacional em logística</w:t>
+              <w:t xml:space="preserve">EasyPrice</w:t>
             </w:r>
             <w:r>
               <w:rPr>
@@ -840,7 +836,7 @@
                 <w:sz w:val="18"/>
                 <w:szCs w:val="18"/>
               </w:rPr>
-              <w:t xml:space="preserve">  Demonstração</w:t>
+              <w:t xml:space="preserve">  Corporativo</w:t>
             </w:r>
           </w:p>
           <w:p>
@@ -854,7 +850,7 @@
                 <w:sz w:val="19"/>
                 <w:szCs w:val="19"/>
               </w:rPr>
-              <w:t xml:space="preserve">Estudo de BI aplicado a operações logísticas, com dados simulados: volume, entregas, ocorrências e SLA por período e região. Demonstração implementada em TypeScript, React e SVG.</w:t>
+              <w:t xml:space="preserve">Plataforma web de simulação de preços de frete rodoviário (LTL e FTL), com regras de pricing, API, banco e hospedagem em ambiente Windows com IIS. Código e dados não públicos.</w:t>
             </w:r>
           </w:p>
           <w:p>
@@ -870,7 +866,7 @@
                 <w:sz w:val="18"/>
                 <w:szCs w:val="18"/>
               </w:rPr>
-              <w:t xml:space="preserve">Conceitos e ferramentas: </w:t>
+              <w:t xml:space="preserve">Tecnologias: </w:t>
             </w:r>
             <w:r>
               <w:rPr>
@@ -879,7 +875,7 @@
                 <w:sz w:val="18"/>
                 <w:szCs w:val="18"/>
               </w:rPr>
-              <w:t xml:space="preserve">Modelagem dimensional, SQL, ETL, Power BI, DAX</w:t>
+              <w:t xml:space="preserve">Python, FastAPI, Next.js, React, TypeScript, SQL Server, IIS</w:t>
             </w:r>
           </w:p>
           <w:p>
@@ -896,7 +892,7 @@
                 <w:sz w:val="19"/>
                 <w:szCs w:val="19"/>
               </w:rPr>
-              <w:t xml:space="preserve">Normalização de cidades com referência do IBGE</w:t>
+              <w:t xml:space="preserve">Normalização de municípios</w:t>
             </w:r>
             <w:r>
               <w:rPr>
@@ -905,7 +901,7 @@
                 <w:sz w:val="18"/>
                 <w:szCs w:val="18"/>
               </w:rPr>
-              <w:t xml:space="preserve">  Estudo · qualidade de dados</w:t>
+              <w:t xml:space="preserve">  Módulo do EasyPrice</w:t>
             </w:r>
           </w:p>
           <w:p>
@@ -919,7 +915,7 @@
                 <w:sz w:val="19"/>
                 <w:szCs w:val="19"/>
               </w:rPr>
-              <w:t xml:space="preserve">Estudo de como reconciliar nomes de cidades digitados de forma livre com uma lista oficial, de modo determinístico e auditável.</w:t>
+              <w:t xml:space="preserve">Conciliação de cidades digitadas com a base oficial de municípios, usando regras, aliases e similaridade de texto, com referência do IBGE e confirmação quando há dúvida.</w:t>
             </w:r>
           </w:p>
           <w:p>
@@ -935,7 +931,7 @@
                 <w:sz w:val="18"/>
                 <w:szCs w:val="18"/>
               </w:rPr>
-              <w:t xml:space="preserve">Conceitos e ferramentas: </w:t>
+              <w:t xml:space="preserve">Tecnologias: </w:t>
             </w:r>
             <w:r>
               <w:rPr>

</xml_diff>

<commit_message>
chore(pages): publica a V3.2.2
</commit_message>
<xml_diff>
--- a/resume/Evanilson_Freitas_Curriculo.docx
+++ b/resume/Evanilson_Freitas_Curriculo.docx
@@ -179,7 +179,7 @@
               <w:t xml:space="preserve">E-mail
 </w:t>
             </w:r>
-            <w:hyperlink w:history="1" r:id="rIdrdytobfe9y9klhdzugqaq">
+            <w:hyperlink w:history="1" r:id="rIdtknncizdmhgn7cy8zdh4a">
               <w:r>
                 <w:rPr>
                   <w:rFonts w:ascii="Arial" w:cs="Arial" w:eastAsia="Arial" w:hAnsi="Arial"/>
@@ -206,7 +206,7 @@
               <w:t xml:space="preserve">Telefone
 </w:t>
             </w:r>
-            <w:hyperlink w:history="1" r:id="rIdibjg9fbs0xwa5dtinp7x7">
+            <w:hyperlink w:history="1" r:id="rIdruakn-bbbioidz5c3l6y-">
               <w:r>
                 <w:rPr>
                   <w:rFonts w:ascii="Arial" w:cs="Arial" w:eastAsia="Arial" w:hAnsi="Arial"/>
@@ -233,7 +233,7 @@
               <w:t xml:space="preserve">LinkedIn
 </w:t>
             </w:r>
-            <w:hyperlink w:history="1" r:id="rIds1f1eizg1eum0qfixt_vr">
+            <w:hyperlink w:history="1" r:id="rIdjsgec21lkamk-xhizsf3s">
               <w:r>
                 <w:rPr>
                   <w:rFonts w:ascii="Arial" w:cs="Arial" w:eastAsia="Arial" w:hAnsi="Arial"/>
@@ -260,7 +260,7 @@
               <w:t xml:space="preserve">GitHub
 </w:t>
             </w:r>
-            <w:hyperlink w:history="1" r:id="rId7gblxas9comojo3tsq5uv">
+            <w:hyperlink w:history="1" r:id="rIdcvirg1jitt0yaryxbn5ex">
               <w:r>
                 <w:rPr>
                   <w:rFonts w:ascii="Arial" w:cs="Arial" w:eastAsia="Arial" w:hAnsi="Arial"/>
@@ -287,7 +287,7 @@
               <w:t xml:space="preserve">Portfólio
 </w:t>
             </w:r>
-            <w:hyperlink w:history="1" r:id="rIdx5bqs78cuewxmcvtc5pel">
+            <w:hyperlink w:history="1" r:id="rIdynjmq-3xufibs9bteepeq">
               <w:r>
                 <w:rPr>
                   <w:rFonts w:ascii="Arial" w:cs="Arial" w:eastAsia="Arial" w:hAnsi="Arial"/>
@@ -526,7 +526,7 @@
                 <w:sz w:val="19"/>
                 <w:szCs w:val="19"/>
               </w:rPr>
-              <w:t xml:space="preserve">Profissional de Business Intelligence e Engenharia de Software, com formação em Análise e Desenvolvimento de Sistemas (Uninove) e MBA em Data Science (USP/ESALQ). Conecta processos de negócio a soluções de dados, automação e software: BI comercial e operacional, precificação, integrações entre sistemas e aplicações web, com projetos em Python, FastAPI, SQL Server, TypeScript e React, e noções de hospedagem em Windows Server e IIS.</w:t>
+              <w:t xml:space="preserve">Profissional de Business Intelligence com trajetória que integra operação logística, inteligência comercial, engenharia de dados e desenvolvimento de software. Atua na construção de soluções analíticas corporativas: modelagem dimensional, transformação e integração de dados, governança de indicadores e análises de produtividade, rentabilidade, precificação e desempenho, com Power BI, DAX, Power Query, SQL Server e Python. Participa do desenvolvimento de plataformas de precificação, automações e soluções orientadas a regras de negócio, com APIs em FastAPI e interfaces em React, Next.js e TypeScript. Conhece hospedagem em IIS e Windows Server e a arquitetura do ecossistema Microsoft Azure e Azure DevOps. Traduz problemas operacionais e comerciais complexos em soluções tecnológicas orientadas à decisão. MBA em Data Science pela USP/ESALQ.</w:t>
             </w:r>
           </w:p>
           <w:p>
@@ -547,6 +547,652 @@
                 <w:sz w:val="18"/>
                 <w:szCs w:val="18"/>
               </w:rPr>
+              <w:t xml:space="preserve">EXPERIÊNCIA PROFISSIONAL</w:t>
+            </w:r>
+          </w:p>
+          <w:p>
+            <w:pPr>
+              <w:keepNext/>
+              <w:spacing w:after="10" w:before="110"/>
+            </w:pPr>
+            <w:r>
+              <w:rPr>
+                <w:rFonts w:ascii="Arial" w:cs="Arial" w:eastAsia="Arial" w:hAnsi="Arial"/>
+                <w:b/>
+                <w:bCs/>
+                <w:color w:val="1F2328"/>
+                <w:sz w:val="22"/>
+                <w:szCs w:val="22"/>
+              </w:rPr>
+              <w:t xml:space="preserve">Tragetta</w:t>
+            </w:r>
+            <w:r>
+              <w:rPr>
+                <w:rFonts w:ascii="Arial" w:cs="Arial" w:eastAsia="Arial" w:hAnsi="Arial"/>
+                <w:color w:val="59636E"/>
+                <w:sz w:val="17"/>
+                <w:szCs w:val="17"/>
+              </w:rPr>
+              <w:t xml:space="preserve">  Guarulhos, São Paulo, Brasil</w:t>
+            </w:r>
+          </w:p>
+          <w:p>
+            <w:pPr>
+              <w:keepNext/>
+              <w:spacing w:after="20" w:before="0"/>
+            </w:pPr>
+            <w:r>
+              <w:rPr>
+                <w:rFonts w:ascii="Arial" w:cs="Arial" w:eastAsia="Arial" w:hAnsi="Arial"/>
+                <w:b/>
+                <w:bCs/>
+                <w:color w:val="59636E"/>
+                <w:sz w:val="17"/>
+                <w:szCs w:val="17"/>
+              </w:rPr>
+              <w:t xml:space="preserve">Atuação: </w:t>
+            </w:r>
+            <w:r>
+              <w:rPr>
+                <w:rFonts w:ascii="Arial" w:cs="Arial" w:eastAsia="Arial" w:hAnsi="Arial"/>
+                <w:color w:val="59636E"/>
+                <w:sz w:val="17"/>
+                <w:szCs w:val="17"/>
+              </w:rPr>
+              <w:t xml:space="preserve">Precificação e rentabilidade · Inteligência comercial e análise de oportunidades · Motores de cálculo · Integrações e automações</w:t>
+            </w:r>
+          </w:p>
+          <w:p>
+            <w:pPr>
+              <w:keepNext/>
+              <w:spacing w:after="0" w:before="50"/>
+            </w:pPr>
+            <w:r>
+              <w:rPr>
+                <w:rFonts w:ascii="Arial" w:cs="Arial" w:eastAsia="Arial" w:hAnsi="Arial"/>
+                <w:b/>
+                <w:bCs/>
+                <w:color w:val="1F2328"/>
+                <w:sz w:val="19"/>
+                <w:szCs w:val="19"/>
+              </w:rPr>
+              <w:t xml:space="preserve">Business Intelligence</w:t>
+            </w:r>
+            <w:r>
+              <w:rPr>
+                <w:rFonts w:ascii="Arial" w:cs="Arial" w:eastAsia="Arial" w:hAnsi="Arial"/>
+                <w:color w:val="59636E"/>
+                <w:sz w:val="17"/>
+                <w:szCs w:val="17"/>
+              </w:rPr>
+              <w:t xml:space="preserve">   jun/2026 – atual</w:t>
+            </w:r>
+          </w:p>
+          <w:p>
+            <w:pPr>
+              <w:keepNext w:val="false"/>
+              <w:spacing w:after="15" w:before="0"/>
+            </w:pPr>
+            <w:r>
+              <w:rPr>
+                <w:rFonts w:ascii="Arial" w:cs="Arial" w:eastAsia="Arial" w:hAnsi="Arial"/>
+                <w:color w:val="59636E"/>
+                <w:sz w:val="16"/>
+                <w:szCs w:val="16"/>
+              </w:rPr>
+              <w:t xml:space="preserve">Híbrido</w:t>
+            </w:r>
+          </w:p>
+          <w:p>
+            <w:pPr>
+              <w:spacing w:after="30" w:before="10"/>
+            </w:pPr>
+            <w:r>
+              <w:rPr>
+                <w:rFonts w:ascii="Arial" w:cs="Arial" w:eastAsia="Arial" w:hAnsi="Arial"/>
+                <w:b/>
+                <w:bCs/>
+                <w:color w:val="59636E"/>
+                <w:sz w:val="16"/>
+                <w:szCs w:val="16"/>
+              </w:rPr>
+              <w:t xml:space="preserve">Competências: </w:t>
+            </w:r>
+            <w:r>
+              <w:rPr>
+                <w:rFonts w:ascii="Arial" w:cs="Arial" w:eastAsia="Arial" w:hAnsi="Arial"/>
+                <w:color w:val="59636E"/>
+                <w:sz w:val="16"/>
+                <w:szCs w:val="16"/>
+              </w:rPr>
+              <w:t xml:space="preserve">SQL, Microsoft Power BI</w:t>
+            </w:r>
+          </w:p>
+          <w:p>
+            <w:pPr>
+              <w:keepNext/>
+              <w:spacing w:after="0" w:before="50"/>
+            </w:pPr>
+            <w:r>
+              <w:rPr>
+                <w:rFonts w:ascii="Arial" w:cs="Arial" w:eastAsia="Arial" w:hAnsi="Arial"/>
+                <w:b/>
+                <w:bCs/>
+                <w:color w:val="1F2328"/>
+                <w:sz w:val="19"/>
+                <w:szCs w:val="19"/>
+              </w:rPr>
+              <w:t xml:space="preserve">Analista de Pricing</w:t>
+            </w:r>
+            <w:r>
+              <w:rPr>
+                <w:rFonts w:ascii="Arial" w:cs="Arial" w:eastAsia="Arial" w:hAnsi="Arial"/>
+                <w:color w:val="59636E"/>
+                <w:sz w:val="17"/>
+                <w:szCs w:val="17"/>
+              </w:rPr>
+              <w:t xml:space="preserve">   jan/2026 – jun/2026</w:t>
+            </w:r>
+          </w:p>
+          <w:p>
+            <w:pPr>
+              <w:keepNext w:val="false"/>
+              <w:spacing w:after="15" w:before="0"/>
+            </w:pPr>
+            <w:r>
+              <w:rPr>
+                <w:rFonts w:ascii="Arial" w:cs="Arial" w:eastAsia="Arial" w:hAnsi="Arial"/>
+                <w:color w:val="59636E"/>
+                <w:sz w:val="16"/>
+                <w:szCs w:val="16"/>
+              </w:rPr>
+              <w:t xml:space="preserve">Tempo integral</w:t>
+            </w:r>
+          </w:p>
+          <w:p>
+            <w:pPr>
+              <w:spacing w:after="30" w:before="10"/>
+            </w:pPr>
+            <w:r>
+              <w:rPr>
+                <w:rFonts w:ascii="Arial" w:cs="Arial" w:eastAsia="Arial" w:hAnsi="Arial"/>
+                <w:b/>
+                <w:bCs/>
+                <w:color w:val="59636E"/>
+                <w:sz w:val="16"/>
+                <w:szCs w:val="16"/>
+              </w:rPr>
+              <w:t xml:space="preserve">Competências: </w:t>
+            </w:r>
+            <w:r>
+              <w:rPr>
+                <w:rFonts w:ascii="Arial" w:cs="Arial" w:eastAsia="Arial" w:hAnsi="Arial"/>
+                <w:color w:val="59636E"/>
+                <w:sz w:val="16"/>
+                <w:szCs w:val="16"/>
+              </w:rPr>
+              <w:t xml:space="preserve">Estatística, Python</w:t>
+            </w:r>
+          </w:p>
+          <w:p>
+            <w:pPr>
+              <w:keepNext/>
+              <w:spacing w:after="0" w:before="50"/>
+            </w:pPr>
+            <w:r>
+              <w:rPr>
+                <w:rFonts w:ascii="Arial" w:cs="Arial" w:eastAsia="Arial" w:hAnsi="Arial"/>
+                <w:b/>
+                <w:bCs/>
+                <w:color w:val="1F2328"/>
+                <w:sz w:val="19"/>
+                <w:szCs w:val="19"/>
+              </w:rPr>
+              <w:t xml:space="preserve">Analista de Dados</w:t>
+            </w:r>
+            <w:r>
+              <w:rPr>
+                <w:rFonts w:ascii="Arial" w:cs="Arial" w:eastAsia="Arial" w:hAnsi="Arial"/>
+                <w:color w:val="59636E"/>
+                <w:sz w:val="17"/>
+                <w:szCs w:val="17"/>
+              </w:rPr>
+              <w:t xml:space="preserve">   mar/2025 – jan/2026</w:t>
+            </w:r>
+          </w:p>
+          <w:p>
+            <w:pPr>
+              <w:keepNext w:val="false"/>
+              <w:spacing w:after="15" w:before="0"/>
+            </w:pPr>
+            <w:r>
+              <w:rPr>
+                <w:rFonts w:ascii="Arial" w:cs="Arial" w:eastAsia="Arial" w:hAnsi="Arial"/>
+                <w:color w:val="59636E"/>
+                <w:sz w:val="16"/>
+                <w:szCs w:val="16"/>
+              </w:rPr>
+              <w:t xml:space="preserve">Tempo integral · Presencial</w:t>
+            </w:r>
+          </w:p>
+          <w:p>
+            <w:pPr>
+              <w:keepNext/>
+              <w:spacing w:after="10" w:before="110"/>
+            </w:pPr>
+            <w:r>
+              <w:rPr>
+                <w:rFonts w:ascii="Arial" w:cs="Arial" w:eastAsia="Arial" w:hAnsi="Arial"/>
+                <w:b/>
+                <w:bCs/>
+                <w:color w:val="1F2328"/>
+                <w:sz w:val="22"/>
+                <w:szCs w:val="22"/>
+              </w:rPr>
+              <w:t xml:space="preserve">Solistica</w:t>
+            </w:r>
+          </w:p>
+          <w:p>
+            <w:pPr>
+              <w:keepNext/>
+              <w:spacing w:after="0" w:before="50"/>
+            </w:pPr>
+            <w:r>
+              <w:rPr>
+                <w:rFonts w:ascii="Arial" w:cs="Arial" w:eastAsia="Arial" w:hAnsi="Arial"/>
+                <w:b/>
+                <w:bCs/>
+                <w:color w:val="1F2328"/>
+                <w:sz w:val="19"/>
+                <w:szCs w:val="19"/>
+              </w:rPr>
+              <w:t xml:space="preserve">Assistente Administrativo</w:t>
+            </w:r>
+            <w:r>
+              <w:rPr>
+                <w:rFonts w:ascii="Arial" w:cs="Arial" w:eastAsia="Arial" w:hAnsi="Arial"/>
+                <w:color w:val="59636E"/>
+                <w:sz w:val="17"/>
+                <w:szCs w:val="17"/>
+              </w:rPr>
+              <w:t xml:space="preserve">   out/2021 – mar/2025</w:t>
+            </w:r>
+          </w:p>
+          <w:p>
+            <w:pPr>
+              <w:keepNext/>
+              <w:spacing w:after="15" w:before="0"/>
+            </w:pPr>
+            <w:r>
+              <w:rPr>
+                <w:rFonts w:ascii="Arial" w:cs="Arial" w:eastAsia="Arial" w:hAnsi="Arial"/>
+                <w:color w:val="59636E"/>
+                <w:sz w:val="16"/>
+                <w:szCs w:val="16"/>
+              </w:rPr>
+              <w:t xml:space="preserve">Tempo integral · São Paulo, Brasil</w:t>
+            </w:r>
+          </w:p>
+          <w:p>
+            <w:pPr>
+              <w:pStyle w:val="ListParagraph"/>
+              <w:numPr>
+                <w:ilvl w:val="0"/>
+                <w:numId w:val="2"/>
+              </w:numPr>
+              <w:spacing w:after="40" w:before="0"/>
+            </w:pPr>
+            <w:r>
+              <w:rPr>
+                <w:rFonts w:ascii="Arial" w:cs="Arial" w:eastAsia="Arial" w:hAnsi="Arial"/>
+                <w:color w:val="1F2328"/>
+                <w:sz w:val="18"/>
+                <w:szCs w:val="18"/>
+              </w:rPr>
+              <w:t xml:space="preserve">Suporte à operação logística, com controle e prevenção de extravios e avarias</w:t>
+            </w:r>
+          </w:p>
+          <w:p>
+            <w:pPr>
+              <w:pStyle w:val="ListParagraph"/>
+              <w:numPr>
+                <w:ilvl w:val="0"/>
+                <w:numId w:val="2"/>
+              </w:numPr>
+              <w:spacing w:after="40" w:before="0"/>
+            </w:pPr>
+            <w:r>
+              <w:rPr>
+                <w:rFonts w:ascii="Arial" w:cs="Arial" w:eastAsia="Arial" w:hAnsi="Arial"/>
+                <w:color w:val="1F2328"/>
+                <w:sz w:val="18"/>
+                <w:szCs w:val="18"/>
+              </w:rPr>
+              <w:t xml:space="preserve">Gestão e análise de dados operacionais, com cálculos estatísticos e análises preditivas para maior previsibilidade</w:t>
+            </w:r>
+          </w:p>
+          <w:p>
+            <w:pPr>
+              <w:pStyle w:val="ListParagraph"/>
+              <w:numPr>
+                <w:ilvl w:val="0"/>
+                <w:numId w:val="2"/>
+              </w:numPr>
+              <w:spacing w:after="40" w:before="0"/>
+            </w:pPr>
+            <w:r>
+              <w:rPr>
+                <w:rFonts w:ascii="Arial" w:cs="Arial" w:eastAsia="Arial" w:hAnsi="Arial"/>
+                <w:color w:val="1F2328"/>
+                <w:sz w:val="18"/>
+                <w:szCs w:val="18"/>
+              </w:rPr>
+              <w:t xml:space="preserve">Criação de indicadores personalizados por cliente e por área</w:t>
+            </w:r>
+          </w:p>
+          <w:p>
+            <w:pPr>
+              <w:pStyle w:val="ListParagraph"/>
+              <w:numPr>
+                <w:ilvl w:val="0"/>
+                <w:numId w:val="2"/>
+              </w:numPr>
+              <w:spacing w:after="40" w:before="0"/>
+            </w:pPr>
+            <w:r>
+              <w:rPr>
+                <w:rFonts w:ascii="Arial" w:cs="Arial" w:eastAsia="Arial" w:hAnsi="Arial"/>
+                <w:color w:val="1F2328"/>
+                <w:sz w:val="18"/>
+                <w:szCs w:val="18"/>
+              </w:rPr>
+              <w:t xml:space="preserve">Administração das tecnologias utilizadas pelo setor</w:t>
+            </w:r>
+          </w:p>
+          <w:p>
+            <w:pPr>
+              <w:pStyle w:val="ListParagraph"/>
+              <w:numPr>
+                <w:ilvl w:val="0"/>
+                <w:numId w:val="2"/>
+              </w:numPr>
+              <w:spacing w:after="40" w:before="0"/>
+            </w:pPr>
+            <w:r>
+              <w:rPr>
+                <w:rFonts w:ascii="Arial" w:cs="Arial" w:eastAsia="Arial" w:hAnsi="Arial"/>
+                <w:color w:val="1F2328"/>
+                <w:sz w:val="18"/>
+                <w:szCs w:val="18"/>
+              </w:rPr>
+              <w:t xml:space="preserve">Identificação de melhorias e otimização de processos</w:t>
+            </w:r>
+          </w:p>
+          <w:p>
+            <w:pPr>
+              <w:pStyle w:val="ListParagraph"/>
+              <w:numPr>
+                <w:ilvl w:val="0"/>
+                <w:numId w:val="2"/>
+              </w:numPr>
+              <w:spacing w:after="40" w:before="0"/>
+            </w:pPr>
+            <w:r>
+              <w:rPr>
+                <w:rFonts w:ascii="Arial" w:cs="Arial" w:eastAsia="Arial" w:hAnsi="Arial"/>
+                <w:color w:val="1F2328"/>
+                <w:sz w:val="18"/>
+                <w:szCs w:val="18"/>
+              </w:rPr>
+              <w:t xml:space="preserve">Preparação de materiais, acompanhamento de resultados e apresentação de indicadores à gestão, em apoio à decisão</w:t>
+            </w:r>
+          </w:p>
+          <w:p>
+            <w:pPr>
+              <w:spacing w:after="30" w:before="10"/>
+            </w:pPr>
+            <w:r>
+              <w:rPr>
+                <w:rFonts w:ascii="Arial" w:cs="Arial" w:eastAsia="Arial" w:hAnsi="Arial"/>
+                <w:b/>
+                <w:bCs/>
+                <w:color w:val="59636E"/>
+                <w:sz w:val="16"/>
+                <w:szCs w:val="16"/>
+              </w:rPr>
+              <w:t xml:space="preserve">Competências: </w:t>
+            </w:r>
+            <w:r>
+              <w:rPr>
+                <w:rFonts w:ascii="Arial" w:cs="Arial" w:eastAsia="Arial" w:hAnsi="Arial"/>
+                <w:color w:val="59636E"/>
+                <w:sz w:val="16"/>
+                <w:szCs w:val="16"/>
+              </w:rPr>
+              <w:t xml:space="preserve">SQL, MySQL, Excel</w:t>
+            </w:r>
+          </w:p>
+          <w:p>
+            <w:pPr>
+              <w:keepNext/>
+              <w:spacing w:after="0" w:before="50"/>
+            </w:pPr>
+            <w:r>
+              <w:rPr>
+                <w:rFonts w:ascii="Arial" w:cs="Arial" w:eastAsia="Arial" w:hAnsi="Arial"/>
+                <w:b/>
+                <w:bCs/>
+                <w:color w:val="1F2328"/>
+                <w:sz w:val="19"/>
+                <w:szCs w:val="19"/>
+              </w:rPr>
+              <w:t xml:space="preserve">Aprendiz</w:t>
+            </w:r>
+            <w:r>
+              <w:rPr>
+                <w:rFonts w:ascii="Arial" w:cs="Arial" w:eastAsia="Arial" w:hAnsi="Arial"/>
+                <w:color w:val="59636E"/>
+                <w:sz w:val="17"/>
+                <w:szCs w:val="17"/>
+              </w:rPr>
+              <w:t xml:space="preserve">   dez/2018 – ago/2020</w:t>
+            </w:r>
+          </w:p>
+          <w:p>
+            <w:pPr>
+              <w:keepNext w:val="false"/>
+              <w:spacing w:after="15" w:before="0"/>
+            </w:pPr>
+            <w:r>
+              <w:rPr>
+                <w:rFonts w:ascii="Arial" w:cs="Arial" w:eastAsia="Arial" w:hAnsi="Arial"/>
+                <w:color w:val="59636E"/>
+                <w:sz w:val="16"/>
+                <w:szCs w:val="16"/>
+              </w:rPr>
+              <w:t xml:space="preserve">Meio período · Presencial · São Paulo, Brasil</w:t>
+            </w:r>
+          </w:p>
+          <w:p>
+            <w:pPr>
+              <w:keepNext/>
+              <w:spacing w:after="10" w:before="110"/>
+            </w:pPr>
+            <w:r>
+              <w:rPr>
+                <w:rFonts w:ascii="Arial" w:cs="Arial" w:eastAsia="Arial" w:hAnsi="Arial"/>
+                <w:b/>
+                <w:bCs/>
+                <w:color w:val="1F2328"/>
+                <w:sz w:val="22"/>
+                <w:szCs w:val="22"/>
+              </w:rPr>
+              <w:t xml:space="preserve">Transface Transportes Ltda.</w:t>
+            </w:r>
+          </w:p>
+          <w:p>
+            <w:pPr>
+              <w:keepNext/>
+              <w:spacing w:after="0" w:before="50"/>
+            </w:pPr>
+            <w:r>
+              <w:rPr>
+                <w:rFonts w:ascii="Arial" w:cs="Arial" w:eastAsia="Arial" w:hAnsi="Arial"/>
+                <w:b/>
+                <w:bCs/>
+                <w:color w:val="1F2328"/>
+                <w:sz w:val="19"/>
+                <w:szCs w:val="19"/>
+              </w:rPr>
+              <w:t xml:space="preserve">Assistente Administrativo</w:t>
+            </w:r>
+            <w:r>
+              <w:rPr>
+                <w:rFonts w:ascii="Arial" w:cs="Arial" w:eastAsia="Arial" w:hAnsi="Arial"/>
+                <w:color w:val="59636E"/>
+                <w:sz w:val="17"/>
+                <w:szCs w:val="17"/>
+              </w:rPr>
+              <w:t xml:space="preserve">   nov/2021 – ago/2022</w:t>
+            </w:r>
+          </w:p>
+          <w:p>
+            <w:pPr>
+              <w:keepNext w:val="false"/>
+              <w:spacing w:after="15" w:before="0"/>
+            </w:pPr>
+            <w:r>
+              <w:rPr>
+                <w:rFonts w:ascii="Arial" w:cs="Arial" w:eastAsia="Arial" w:hAnsi="Arial"/>
+                <w:color w:val="59636E"/>
+                <w:sz w:val="16"/>
+                <w:szCs w:val="16"/>
+              </w:rPr>
+              <w:t xml:space="preserve">Tempo integral · Presencial · São Paulo, São Paulo, Brasil</w:t>
+            </w:r>
+          </w:p>
+          <w:p>
+            <w:pPr>
+              <w:spacing w:after="30" w:before="10"/>
+            </w:pPr>
+            <w:r>
+              <w:rPr>
+                <w:rFonts w:ascii="Arial" w:cs="Arial" w:eastAsia="Arial" w:hAnsi="Arial"/>
+                <w:b/>
+                <w:bCs/>
+                <w:color w:val="59636E"/>
+                <w:sz w:val="16"/>
+                <w:szCs w:val="16"/>
+              </w:rPr>
+              <w:t xml:space="preserve">Competências: </w:t>
+            </w:r>
+            <w:r>
+              <w:rPr>
+                <w:rFonts w:ascii="Arial" w:cs="Arial" w:eastAsia="Arial" w:hAnsi="Arial"/>
+                <w:color w:val="59636E"/>
+                <w:sz w:val="16"/>
+                <w:szCs w:val="16"/>
+              </w:rPr>
+              <w:t xml:space="preserve">Expedição</w:t>
+            </w:r>
+          </w:p>
+        </w:tc>
+      </w:tr>
+    </w:tbl>
+    <w:p>
+      <w:pPr>
+        <w:spacing w:after="0" w:before="0"/>
+        <w:sectPr>
+          <w:pgSz w:w="11906" w:h="16838" w:orient="portrait"/>
+          <w:pgMar w:top="0" w:right="0" w:bottom="0" w:left="0" w:header="708" w:footer="708" w:gutter="0"/>
+          <w:pgNumType/>
+          <w:docGrid w:linePitch="360"/>
+        </w:sectPr>
+      </w:pPr>
+      <w:r>
+        <w:rPr>
+          <w:sz w:val="2"/>
+          <w:szCs w:val="2"/>
+        </w:rPr>
+        <w:t xml:space="preserve"/>
+      </w:r>
+    </w:p>
+    <w:tbl>
+      <w:tblPr>
+        <w:tblW w:type="dxa" w:w="11906"/>
+        <w:tblBorders>
+          <w:top w:val="none" w:color="FFFFFF" w:sz="0"/>
+          <w:left w:val="none" w:color="FFFFFF" w:sz="0"/>
+          <w:bottom w:val="none" w:color="FFFFFF" w:sz="0"/>
+          <w:right w:val="none" w:color="FFFFFF" w:sz="0"/>
+          <w:insideH w:val="none" w:color="FFFFFF" w:sz="0"/>
+          <w:insideV w:val="none" w:color="FFFFFF" w:sz="0"/>
+        </w:tblBorders>
+        <w:tblLayout w:type="fixed"/>
+      </w:tblPr>
+      <w:tblGrid>
+        <w:gridCol w:w="3900"/>
+        <w:gridCol w:w="8006"/>
+      </w:tblGrid>
+      <w:tr>
+        <w:trPr>
+          <w:trHeight w:val="16760" w:hRule="atLeast"/>
+        </w:trPr>
+        <w:tc>
+          <w:tcPr>
+            <w:tcW w:type="dxa" w:w="3900"/>
+            <w:tcBorders>
+              <w:top w:val="none" w:color="FFFFFF" w:sz="0"/>
+              <w:left w:val="none" w:color="FFFFFF" w:sz="0"/>
+              <w:bottom w:val="none" w:color="FFFFFF" w:sz="0"/>
+              <w:right w:val="none" w:color="FFFFFF" w:sz="0"/>
+            </w:tcBorders>
+            <w:shd w:fill="24292F" w:color="auto" w:val="clear"/>
+            <w:tcMar>
+              <w:top w:type="dxa" w:w="620"/>
+              <w:left w:type="dxa" w:w="420"/>
+              <w:bottom w:type="dxa" w:w="400"/>
+              <w:right w:type="dxa" w:w="320"/>
+            </w:tcMar>
+            <w:vAlign w:val="top"/>
+          </w:tcPr>
+          <w:p/>
+        </w:tc>
+        <w:tc>
+          <w:tcPr>
+            <w:tcW w:type="dxa" w:w="8006"/>
+            <w:tcBorders>
+              <w:top w:val="none" w:color="FFFFFF" w:sz="0"/>
+              <w:left w:val="none" w:color="FFFFFF" w:sz="0"/>
+              <w:bottom w:val="none" w:color="FFFFFF" w:sz="0"/>
+              <w:right w:val="none" w:color="FFFFFF" w:sz="0"/>
+            </w:tcBorders>
+            <w:tcMar>
+              <w:top w:type="dxa" w:w="620"/>
+              <w:left w:type="dxa" w:w="520"/>
+              <w:bottom w:type="dxa" w:w="400"/>
+              <w:right w:type="dxa" w:w="560"/>
+            </w:tcMar>
+            <w:vAlign w:val="top"/>
+          </w:tcPr>
+          <w:p>
+            <w:pPr>
+              <w:keepNext/>
+              <w:pBdr>
+                <w:bottom w:val="single" w:color="D1D9E0" w:sz="6" w:space="3"/>
+              </w:pBdr>
+              <w:spacing w:after="100" w:before="280"/>
+            </w:pPr>
+            <w:r>
+              <w:rPr>
+                <w:rFonts w:ascii="Arial" w:cs="Arial" w:eastAsia="Arial" w:hAnsi="Arial"/>
+                <w:b/>
+                <w:bCs/>
+                <w:color w:val="1F2328"/>
+                <w:spacing w:val="24"/>
+                <w:sz w:val="18"/>
+                <w:szCs w:val="18"/>
+              </w:rPr>
               <w:t xml:space="preserve">FORMAÇÃO ACADÊMICA</w:t>
             </w:r>
           </w:p>
@@ -606,7 +1252,7 @@
                 <w:sz w:val="19"/>
                 <w:szCs w:val="19"/>
               </w:rPr>
-              <w:t xml:space="preserve">Análise e Desenvolvimento de Sistemas</w:t>
+              <w:t xml:space="preserve">Tecnologia em Análise e Desenvolvimento de Sistemas</w:t>
             </w:r>
             <w:r>
               <w:rPr>
@@ -632,6 +1278,20 @@
                 <w:szCs w:val="19"/>
               </w:rPr>
               <w:t xml:space="preserve">Universidade Nove de Julho (Uninove)</w:t>
+            </w:r>
+          </w:p>
+          <w:p>
+            <w:pPr>
+              <w:spacing w:after="20" w:before="0"/>
+            </w:pPr>
+            <w:r>
+              <w:rPr>
+                <w:rFonts w:ascii="Arial" w:cs="Arial" w:eastAsia="Arial" w:hAnsi="Arial"/>
+                <w:color w:val="59636E"/>
+                <w:sz w:val="18"/>
+                <w:szCs w:val="18"/>
+              </w:rPr>
+              <w:t xml:space="preserve">Período: jan de 2022 – jul de 2024</w:t>
             </w:r>
           </w:p>
           <w:p>
@@ -1142,6 +1802,12 @@
   </w:abstractNum>
   <w:num w:numId="1">
     <w:abstractNumId w:val="1"/>
+    <w:lvlOverride w:ilvl="0">
+      <w:startOverride w:val="1"/>
+    </w:lvlOverride>
+  </w:num>
+  <w:num w:numId="2">
+    <w:abstractNumId w:val="2"/>
     <w:lvlOverride w:ilvl="0">
       <w:startOverride w:val="1"/>
     </w:lvlOverride>

</xml_diff>